<commit_message>
docs: aplicar cursiva a los extranjerismos del informe 2.6
Co-Authored-By: Claude Opus 5.5 <noreply@anthropic.com>
Claude-Session: https://claude.ai/code/session_019yAiQ6SJ8faHeryAa6w9Vi
</commit_message>
<xml_diff>
--- a/Fase 2/Evidencias Grupales/2.6_GuiaEstudiante_Fase 2_Informe Final Proyecto APT.docx
+++ b/Fase 2/Evidencias Grupales/2.6_GuiaEstudiante_Fase 2_Informe Final Proyecto APT.docx
@@ -759,7 +759,87 @@
                 <w:color w:val="000000"/>
                 <w:sz w:val="20"/>
               </w:rPr>
-              <w:t>Desarrollo de software (Back End, Front End y Full Stack), bases de datos, ingeniería de requisitos, calidad de software y gestión de proyectos informáticos.</w:t>
+              <w:t xml:space="preserve">Desarrollo de </w:t>
+            </w:r>
+            <w:r>
+              <w:rPr>
+                <w:i/>
+                <w:color w:val="000000"/>
+                <w:sz w:val="20"/>
+              </w:rPr>
+              <w:t>software</w:t>
+            </w:r>
+            <w:r>
+              <w:rPr>
+                <w:i w:val="0"/>
+                <w:color w:val="000000"/>
+                <w:sz w:val="20"/>
+              </w:rPr>
+              <w:t xml:space="preserve"> (</w:t>
+            </w:r>
+            <w:r>
+              <w:rPr>
+                <w:i/>
+                <w:color w:val="000000"/>
+                <w:sz w:val="20"/>
+              </w:rPr>
+              <w:t>Back End</w:t>
+            </w:r>
+            <w:r>
+              <w:rPr>
+                <w:i w:val="0"/>
+                <w:color w:val="000000"/>
+                <w:sz w:val="20"/>
+              </w:rPr>
+              <w:t xml:space="preserve">, </w:t>
+            </w:r>
+            <w:r>
+              <w:rPr>
+                <w:i/>
+                <w:color w:val="000000"/>
+                <w:sz w:val="20"/>
+              </w:rPr>
+              <w:t>Front End</w:t>
+            </w:r>
+            <w:r>
+              <w:rPr>
+                <w:i w:val="0"/>
+                <w:color w:val="000000"/>
+                <w:sz w:val="20"/>
+              </w:rPr>
+              <w:t xml:space="preserve"> y </w:t>
+            </w:r>
+            <w:r>
+              <w:rPr>
+                <w:i/>
+                <w:color w:val="000000"/>
+                <w:sz w:val="20"/>
+              </w:rPr>
+              <w:t>Full Stack</w:t>
+            </w:r>
+            <w:r>
+              <w:rPr>
+                <w:i w:val="0"/>
+                <w:color w:val="000000"/>
+                <w:sz w:val="20"/>
+              </w:rPr>
+              <w:t xml:space="preserve">), bases de datos, ingeniería de requisitos, calidad de </w:t>
+            </w:r>
+            <w:r>
+              <w:rPr>
+                <w:i/>
+                <w:color w:val="000000"/>
+                <w:sz w:val="20"/>
+              </w:rPr>
+              <w:t>software</w:t>
+            </w:r>
+            <w:r>
+              <w:rPr>
+                <w:i w:val="0"/>
+                <w:color w:val="000000"/>
+                <w:sz w:val="20"/>
+              </w:rPr>
+              <w:t xml:space="preserve"> y gestión de proyectos informáticos.</w:t>
             </w:r>
           </w:p>
         </w:tc>
@@ -856,7 +936,23 @@
                 <w:color w:val="000000"/>
                 <w:sz w:val="20"/>
               </w:rPr>
-              <w:t>Desarrollar una solución de software utilizando técnicas que permitan sistematizar el proceso de desarrollo y mantenimiento, asegurando el logro de los objetivos.</w:t>
+              <w:t xml:space="preserve">Desarrollar una solución de </w:t>
+            </w:r>
+            <w:r>
+              <w:rPr>
+                <w:i/>
+                <w:color w:val="000000"/>
+                <w:sz w:val="20"/>
+              </w:rPr>
+              <w:t>software</w:t>
+            </w:r>
+            <w:r>
+              <w:rPr>
+                <w:i w:val="0"/>
+                <w:color w:val="000000"/>
+                <w:sz w:val="20"/>
+              </w:rPr>
+              <w:t xml:space="preserve"> utilizando técnicas que permitan sistematizar el proceso de desarrollo y mantenimiento, asegurando el logro de los objetivos.</w:t>
             </w:r>
           </w:p>
           <w:p>
@@ -1074,7 +1170,23 @@
                 <w:color w:val="000000"/>
                 <w:sz w:val="20"/>
               </w:rPr>
-              <w:t xml:space="preserve"> La contraparte no continuó la colaboración después de la reunión inicial y, con autorización del docente, el proyecto sigue sin cliente real; el aporte es, por tanto, simulado sobre una caracterización real. Se expresa en metas medibles del Product Vision: responder una consulta de disponibilidad en menos de 2 segundos, identificar el 100 % de los equipos por número de serie, alertar el 100 % de los arriendos vencidos y llevar a cero los equipos comprometidos en dos operaciones a la vez.</w:t>
+              <w:t xml:space="preserve"> La contraparte no continuó la colaboración después de la reunión inicial y, con autorización del docente, el proyecto sigue sin cliente real; el aporte es, por tanto, simulado sobre una caracterización real. Se expresa en metas medibles del </w:t>
+            </w:r>
+            <w:r>
+              <w:rPr>
+                <w:i/>
+                <w:color w:val="000000"/>
+                <w:sz w:val="20"/>
+              </w:rPr>
+              <w:t>Product Vision</w:t>
+            </w:r>
+            <w:r>
+              <w:rPr>
+                <w:i w:val="0"/>
+                <w:color w:val="000000"/>
+                <w:sz w:val="20"/>
+              </w:rPr>
+              <w:t>: responder una consulta de disponibilidad en menos de 2 segundos, identificar el 100 % de los equipos por número de serie, alertar el 100 % de los arriendos vencidos y llevar a cero los equipos comprometidos en dos operaciones a la vez.</w:t>
             </w:r>
           </w:p>
         </w:tc>
@@ -1404,7 +1516,23 @@
                 <w:color w:val="000000"/>
                 <w:sz w:val="20"/>
               </w:rPr>
-              <w:t xml:space="preserve"> Problema, objetivos, alcance y nueve épicas dimensionadas con Poker Planning en cien puntos de función.</w:t>
+              <w:t xml:space="preserve"> Problema, objetivos, alcance y nueve épicas dimensionadas con </w:t>
+            </w:r>
+            <w:r>
+              <w:rPr>
+                <w:i/>
+                <w:color w:val="000000"/>
+                <w:sz w:val="20"/>
+              </w:rPr>
+              <w:t>Poker Planning</w:t>
+            </w:r>
+            <w:r>
+              <w:rPr>
+                <w:i w:val="0"/>
+                <w:color w:val="000000"/>
+                <w:sz w:val="20"/>
+              </w:rPr>
+              <w:t xml:space="preserve"> en cien puntos de función.</w:t>
             </w:r>
           </w:p>
           <w:p>
@@ -1488,7 +1616,23 @@
                 <w:color w:val="000000"/>
                 <w:sz w:val="20"/>
               </w:rPr>
-              <w:t xml:space="preserve"> Cada historia incluye su prueba automatizada como parte de la Definition of Done.</w:t>
+              <w:t xml:space="preserve"> Cada historia incluye su prueba automatizada como parte de la </w:t>
+            </w:r>
+            <w:r>
+              <w:rPr>
+                <w:i/>
+                <w:color w:val="000000"/>
+                <w:sz w:val="20"/>
+              </w:rPr>
+              <w:t>Definition of Done</w:t>
+            </w:r>
+            <w:r>
+              <w:rPr>
+                <w:i w:val="0"/>
+                <w:color w:val="000000"/>
+                <w:sz w:val="20"/>
+              </w:rPr>
+              <w:t>.</w:t>
             </w:r>
           </w:p>
           <w:p>
@@ -1545,7 +1689,55 @@
                 <w:color w:val="000000"/>
                 <w:sz w:val="20"/>
               </w:rPr>
-              <w:t xml:space="preserve">Los artefactos del marco están en la carpeta Fase 2 del repositorio: Product Vision, Product Backlog priorizado con 28 historias de usuario, Definition of Done y Documento de Diseño. El seguimiento se hace en dos sincronizaciones semanales y en el tablero de GitHub Projects. Desde la semana 8, por sugerencia del docente, se trabaja con </w:t>
+              <w:t xml:space="preserve">Los artefactos del marco están en la carpeta Fase 2 del repositorio: </w:t>
+            </w:r>
+            <w:r>
+              <w:rPr>
+                <w:i/>
+                <w:color w:val="000000"/>
+                <w:sz w:val="20"/>
+              </w:rPr>
+              <w:t>Product Vision</w:t>
+            </w:r>
+            <w:r>
+              <w:rPr>
+                <w:i w:val="0"/>
+                <w:color w:val="000000"/>
+                <w:sz w:val="20"/>
+              </w:rPr>
+              <w:t xml:space="preserve">, </w:t>
+            </w:r>
+            <w:r>
+              <w:rPr>
+                <w:i/>
+                <w:color w:val="000000"/>
+                <w:sz w:val="20"/>
+              </w:rPr>
+              <w:t>Product Backlog</w:t>
+            </w:r>
+            <w:r>
+              <w:rPr>
+                <w:i w:val="0"/>
+                <w:color w:val="000000"/>
+                <w:sz w:val="20"/>
+              </w:rPr>
+              <w:t xml:space="preserve"> priorizado con 28 historias de usuario, </w:t>
+            </w:r>
+            <w:r>
+              <w:rPr>
+                <w:i/>
+                <w:color w:val="000000"/>
+                <w:sz w:val="20"/>
+              </w:rPr>
+              <w:t>Definition of Done</w:t>
+            </w:r>
+            <w:r>
+              <w:rPr>
+                <w:i w:val="0"/>
+                <w:color w:val="000000"/>
+                <w:sz w:val="20"/>
+              </w:rPr>
+              <w:t xml:space="preserve"> y Documento de Diseño. El seguimiento se hace en dos sincronizaciones semanales y en el tablero de GitHub Projects. Desde la semana 8, por sugerencia del docente, se trabaja con </w:t>
             </w:r>
             <w:r>
               <w:rPr>
@@ -1562,7 +1754,23 @@
                 <w:color w:val="000000"/>
                 <w:sz w:val="20"/>
               </w:rPr>
-              <w:t xml:space="preserve"> que se integra a la rama principal mediante un pull request revisado por el otro integrante (decisión D11). El esquema de base de datos se versiona con migraciones de Flyway que nunca se editan, y las reglas del proyecto (capas, transacciones, filtro por empresa, zonas de propiedad del código) están escritas en el repositorio, de modo que ambos integrantes y sus asistentes de programación trabajan con las mismas normas.</w:t>
+              <w:t xml:space="preserve"> que se integra a la rama principal mediante un </w:t>
+            </w:r>
+            <w:r>
+              <w:rPr>
+                <w:i/>
+                <w:color w:val="000000"/>
+                <w:sz w:val="20"/>
+              </w:rPr>
+              <w:t>pull request</w:t>
+            </w:r>
+            <w:r>
+              <w:rPr>
+                <w:i w:val="0"/>
+                <w:color w:val="000000"/>
+                <w:sz w:val="20"/>
+              </w:rPr>
+              <w:t xml:space="preserve"> revisado por el otro integrante (decisión D11). El esquema de base de datos se versiona con migraciones de Flyway que nunca se editan, y las reglas del proyecto (capas, transacciones, filtro por empresa, zonas de propiedad del código) están escritas en el repositorio, de modo que ambos integrantes y sus asistentes de programación trabajan con las mismas normas.</w:t>
             </w:r>
           </w:p>
           <w:p>
@@ -1608,7 +1816,39 @@
                 <w:color w:val="000000"/>
                 <w:sz w:val="20"/>
               </w:rPr>
-              <w:t xml:space="preserve"> La metodología permitió detectar el atraso y corregirlo sin perder alcance: el monitoreo de la semana 6 mostró que la planificación tenía rangos de semanas pero no hitos verificables, y la respuesta fue formalizar los sprints con demostración obligatoria y una Definition of Done escrita.</w:t>
+              <w:t xml:space="preserve"> La metodología permitió detectar el atraso y corregirlo sin perder alcance: el monitoreo de la semana 6 mostró que la planificación tenía rangos de semanas pero no hitos verificables, y la respuesta fue formalizar los </w:t>
+            </w:r>
+            <w:r>
+              <w:rPr>
+                <w:i/>
+                <w:color w:val="000000"/>
+                <w:sz w:val="20"/>
+              </w:rPr>
+              <w:t>sprints</w:t>
+            </w:r>
+            <w:r>
+              <w:rPr>
+                <w:i w:val="0"/>
+                <w:color w:val="000000"/>
+                <w:sz w:val="20"/>
+              </w:rPr>
+              <w:t xml:space="preserve"> con demostración obligatoria y una </w:t>
+            </w:r>
+            <w:r>
+              <w:rPr>
+                <w:i/>
+                <w:color w:val="000000"/>
+                <w:sz w:val="20"/>
+              </w:rPr>
+              <w:t>Definition of Done</w:t>
+            </w:r>
+            <w:r>
+              <w:rPr>
+                <w:i w:val="0"/>
+                <w:color w:val="000000"/>
+                <w:sz w:val="20"/>
+              </w:rPr>
+              <w:t xml:space="preserve"> escrita.</w:t>
             </w:r>
           </w:p>
         </w:tc>
@@ -1908,7 +2148,23 @@
                       <w:color w:val="000000"/>
                       <w:sz w:val="18"/>
                     </w:rPr>
-                    <w:t>Completada: pull request #1</w:t>
+                    <w:t xml:space="preserve">Completada: </w:t>
+                  </w:r>
+                  <w:r>
+                    <w:rPr>
+                      <w:i/>
+                      <w:color w:val="000000"/>
+                      <w:sz w:val="18"/>
+                    </w:rPr>
+                    <w:t>pull request</w:t>
+                  </w:r>
+                  <w:r>
+                    <w:rPr>
+                      <w:i w:val="0"/>
+                      <w:color w:val="000000"/>
+                      <w:sz w:val="18"/>
+                    </w:rPr>
+                    <w:t xml:space="preserve"> #1</w:t>
                   </w:r>
                 </w:p>
               </w:tc>
@@ -2273,7 +2529,23 @@
                 <w:color w:val="000000"/>
                 <w:sz w:val="20"/>
               </w:rPr>
-              <w:t>La documentación técnica escrita antes de programar (modelo de datos, arquitectura, convenciones y registro de decisiones) permitió retomar el trabajo tras varias semanas sin volver a decidir nada. Las zonas de propiedad del código permiten trabajar en paralelo sin conflictos, el stack no tiene costo de licencias y los contenedores eliminan las diferencias de configuración entre equipos.</w:t>
+              <w:t xml:space="preserve">La documentación técnica escrita antes de programar (modelo de datos, arquitectura, convenciones y registro de decisiones) permitió retomar el trabajo tras varias semanas sin volver a decidir nada. Las zonas de propiedad del código permiten trabajar en paralelo sin conflictos, el </w:t>
+            </w:r>
+            <w:r>
+              <w:rPr>
+                <w:i/>
+                <w:color w:val="000000"/>
+                <w:sz w:val="20"/>
+              </w:rPr>
+              <w:t>stack</w:t>
+            </w:r>
+            <w:r>
+              <w:rPr>
+                <w:i w:val="0"/>
+                <w:color w:val="000000"/>
+                <w:sz w:val="20"/>
+              </w:rPr>
+              <w:t xml:space="preserve"> no tiene costo de licencias y los contenedores eliminan las diferencias de configuración entre equipos.</w:t>
             </w:r>
           </w:p>
           <w:p>
@@ -2400,7 +2672,23 @@
                 <w:color w:val="000000"/>
                 <w:sz w:val="20"/>
               </w:rPr>
-              <w:t xml:space="preserve"> Los rangos de semanas permitieron que el desarrollo se detuviera sin que se activara ninguna alarma: el último commit de código fue del 10 de septiembre.</w:t>
+              <w:t xml:space="preserve"> Los rangos de semanas permitieron que el desarrollo se detuviera sin que se activara ninguna alarma: el último </w:t>
+            </w:r>
+            <w:r>
+              <w:rPr>
+                <w:i/>
+                <w:color w:val="000000"/>
+                <w:sz w:val="20"/>
+              </w:rPr>
+              <w:t>commit</w:t>
+            </w:r>
+            <w:r>
+              <w:rPr>
+                <w:i w:val="0"/>
+                <w:color w:val="000000"/>
+                <w:sz w:val="20"/>
+              </w:rPr>
+              <w:t xml:space="preserve"> de código fue del 10 de septiembre.</w:t>
             </w:r>
           </w:p>
           <w:p>
@@ -2472,7 +2760,39 @@
                 <w:color w:val="000000"/>
                 <w:sz w:val="20"/>
               </w:rPr>
-              <w:t>Se definió un traspaso por paquetes de Git (bundle) que conserva la autoría de los commits mientras se recuperaba el acceso.</w:t>
+              <w:t>Se definió un traspaso por paquetes de Git (</w:t>
+            </w:r>
+            <w:r>
+              <w:rPr>
+                <w:i/>
+                <w:color w:val="000000"/>
+                <w:sz w:val="20"/>
+              </w:rPr>
+              <w:t>bundle</w:t>
+            </w:r>
+            <w:r>
+              <w:rPr>
+                <w:i w:val="0"/>
+                <w:color w:val="000000"/>
+                <w:sz w:val="20"/>
+              </w:rPr>
+              <w:t xml:space="preserve">) que conserva la autoría de los </w:t>
+            </w:r>
+            <w:r>
+              <w:rPr>
+                <w:i/>
+                <w:color w:val="000000"/>
+                <w:sz w:val="20"/>
+              </w:rPr>
+              <w:t>commits</w:t>
+            </w:r>
+            <w:r>
+              <w:rPr>
+                <w:i w:val="0"/>
+                <w:color w:val="000000"/>
+                <w:sz w:val="20"/>
+              </w:rPr>
+              <w:t xml:space="preserve"> mientras se recuperaba el acceso.</w:t>
             </w:r>
           </w:p>
           <w:p>
@@ -2491,7 +2811,39 @@
                 <w:color w:val="000000"/>
                 <w:sz w:val="20"/>
               </w:rPr>
-              <w:t>Se formalizaron los sprints de dos semanas con objetivo, demostración y Definition of Done; las historias del Sprint 1 pasaron al Sprint 2.</w:t>
+              <w:t xml:space="preserve">Se formalizaron los </w:t>
+            </w:r>
+            <w:r>
+              <w:rPr>
+                <w:i/>
+                <w:color w:val="000000"/>
+                <w:sz w:val="20"/>
+              </w:rPr>
+              <w:t>sprints</w:t>
+            </w:r>
+            <w:r>
+              <w:rPr>
+                <w:i w:val="0"/>
+                <w:color w:val="000000"/>
+                <w:sz w:val="20"/>
+              </w:rPr>
+              <w:t xml:space="preserve"> de dos semanas con objetivo, demostración y </w:t>
+            </w:r>
+            <w:r>
+              <w:rPr>
+                <w:i/>
+                <w:color w:val="000000"/>
+                <w:sz w:val="20"/>
+              </w:rPr>
+              <w:t>Definition of Done</w:t>
+            </w:r>
+            <w:r>
+              <w:rPr>
+                <w:i w:val="0"/>
+                <w:color w:val="000000"/>
+                <w:sz w:val="20"/>
+              </w:rPr>
+              <w:t>; las historias del Sprint 1 pasaron al Sprint 2.</w:t>
             </w:r>
           </w:p>
           <w:p>
@@ -2510,7 +2862,23 @@
                 <w:color w:val="000000"/>
                 <w:sz w:val="20"/>
               </w:rPr>
-              <w:t>Se adoptó una rama por semana con revisión cruzada por pull request, a sugerencia del docente.</w:t>
+              <w:t xml:space="preserve">Se adoptó una rama por semana con revisión cruzada por </w:t>
+            </w:r>
+            <w:r>
+              <w:rPr>
+                <w:i/>
+                <w:color w:val="000000"/>
+                <w:sz w:val="20"/>
+              </w:rPr>
+              <w:t>pull request</w:t>
+            </w:r>
+            <w:r>
+              <w:rPr>
+                <w:i w:val="0"/>
+                <w:color w:val="000000"/>
+                <w:sz w:val="20"/>
+              </w:rPr>
+              <w:t>, a sugerencia del docente.</w:t>
             </w:r>
           </w:p>
           <w:p>
@@ -2638,7 +3006,23 @@
                       <w:color w:val="000000"/>
                       <w:sz w:val="18"/>
                     </w:rPr>
-                    <w:t>No hubo entregable intermedio: el sprint terminó sin migraciones ni entidades.</w:t>
+                    <w:t xml:space="preserve">No hubo entregable intermedio: el </w:t>
+                  </w:r>
+                  <w:r>
+                    <w:rPr>
+                      <w:i/>
+                      <w:color w:val="000000"/>
+                      <w:sz w:val="18"/>
+                    </w:rPr>
+                    <w:t>sprint</w:t>
+                  </w:r>
+                  <w:r>
+                    <w:rPr>
+                      <w:i w:val="0"/>
+                      <w:color w:val="000000"/>
+                      <w:sz w:val="18"/>
+                    </w:rPr>
+                    <w:t xml:space="preserve"> terminó sin migraciones ni entidades.</w:t>
                   </w:r>
                 </w:p>
               </w:tc>
@@ -2653,7 +3037,39 @@
                       <w:color w:val="000000"/>
                       <w:sz w:val="18"/>
                     </w:rPr>
-                    <w:t>Demostración obligatoria al cierre de cada sprint y Definition of Done escrita.</w:t>
+                    <w:t xml:space="preserve">Demostración obligatoria al cierre de cada </w:t>
+                  </w:r>
+                  <w:r>
+                    <w:rPr>
+                      <w:i/>
+                      <w:color w:val="000000"/>
+                      <w:sz w:val="18"/>
+                    </w:rPr>
+                    <w:t>sprint</w:t>
+                  </w:r>
+                  <w:r>
+                    <w:rPr>
+                      <w:i w:val="0"/>
+                      <w:color w:val="000000"/>
+                      <w:sz w:val="18"/>
+                    </w:rPr>
+                    <w:t xml:space="preserve"> y </w:t>
+                  </w:r>
+                  <w:r>
+                    <w:rPr>
+                      <w:i/>
+                      <w:color w:val="000000"/>
+                      <w:sz w:val="18"/>
+                    </w:rPr>
+                    <w:t>Definition of Done</w:t>
+                  </w:r>
+                  <w:r>
+                    <w:rPr>
+                      <w:i w:val="0"/>
+                      <w:color w:val="000000"/>
+                      <w:sz w:val="18"/>
+                    </w:rPr>
+                    <w:t xml:space="preserve"> escrita.</w:t>
                   </w:r>
                 </w:p>
               </w:tc>
@@ -2696,11 +3112,19 @@
                 <w:p>
                   <w:r>
                     <w:rPr>
-                      <w:i w:val="0"/>
-                      <w:color w:val="000000"/>
-                      <w:sz w:val="18"/>
-                    </w:rPr>
-                    <w:t>Product Vision, Backlog, DoD y Diseño entregados en la semana 8.</w:t>
+                      <w:i/>
+                      <w:color w:val="000000"/>
+                      <w:sz w:val="18"/>
+                    </w:rPr>
+                    <w:t>Product Vision</w:t>
+                  </w:r>
+                  <w:r>
+                    <w:rPr>
+                      <w:i w:val="0"/>
+                      <w:color w:val="000000"/>
+                      <w:sz w:val="18"/>
+                    </w:rPr>
+                    <w:t>, Backlog, DoD y Diseño entregados en la semana 8.</w:t>
                   </w:r>
                 </w:p>
               </w:tc>
@@ -2747,7 +3171,23 @@
                       <w:color w:val="000000"/>
                       <w:sz w:val="18"/>
                     </w:rPr>
-                    <w:t>Una rama por semana con pull request revisado al cierre.</w:t>
+                    <w:t xml:space="preserve">Una rama por semana con </w:t>
+                  </w:r>
+                  <w:r>
+                    <w:rPr>
+                      <w:i/>
+                      <w:color w:val="000000"/>
+                      <w:sz w:val="18"/>
+                    </w:rPr>
+                    <w:t>pull request</w:t>
+                  </w:r>
+                  <w:r>
+                    <w:rPr>
+                      <w:i w:val="0"/>
+                      <w:color w:val="000000"/>
+                      <w:sz w:val="18"/>
+                    </w:rPr>
+                    <w:t xml:space="preserve"> revisado al cierre.</w:t>
                   </w:r>
                 </w:p>
               </w:tc>
@@ -2894,11 +3334,51 @@
                 <w:p>
                   <w:r>
                     <w:rPr>
-                      <w:i w:val="0"/>
-                      <w:color w:val="000000"/>
-                      <w:sz w:val="18"/>
-                    </w:rPr>
-                    <w:t>Product Vision, Product Backlog, Definition of Done y Documento de Diseño</w:t>
+                      <w:i/>
+                      <w:color w:val="000000"/>
+                      <w:sz w:val="18"/>
+                    </w:rPr>
+                    <w:t>Product Vision</w:t>
+                  </w:r>
+                  <w:r>
+                    <w:rPr>
+                      <w:i w:val="0"/>
+                      <w:color w:val="000000"/>
+                      <w:sz w:val="18"/>
+                    </w:rPr>
+                    <w:t xml:space="preserve">, </w:t>
+                  </w:r>
+                  <w:r>
+                    <w:rPr>
+                      <w:i/>
+                      <w:color w:val="000000"/>
+                      <w:sz w:val="18"/>
+                    </w:rPr>
+                    <w:t>Product Backlog</w:t>
+                  </w:r>
+                  <w:r>
+                    <w:rPr>
+                      <w:i w:val="0"/>
+                      <w:color w:val="000000"/>
+                      <w:sz w:val="18"/>
+                    </w:rPr>
+                    <w:t xml:space="preserve">, </w:t>
+                  </w:r>
+                  <w:r>
+                    <w:rPr>
+                      <w:i/>
+                      <w:color w:val="000000"/>
+                      <w:sz w:val="18"/>
+                    </w:rPr>
+                    <w:t>Definition of Done</w:t>
+                  </w:r>
+                  <w:r>
+                    <w:rPr>
+                      <w:i w:val="0"/>
+                      <w:color w:val="000000"/>
+                      <w:sz w:val="18"/>
+                    </w:rPr>
+                    <w:t xml:space="preserve"> y Documento de Diseño</w:t>
                   </w:r>
                 </w:p>
               </w:tc>
@@ -3321,7 +3801,31 @@
                       <w:color w:val="000000"/>
                       <w:sz w:val="18"/>
                     </w:rPr>
-                    <w:t>Historial de commits y pull requests</w:t>
+                    <w:t xml:space="preserve">Historial de </w:t>
+                  </w:r>
+                  <w:r>
+                    <w:rPr>
+                      <w:i/>
+                      <w:color w:val="000000"/>
+                      <w:sz w:val="18"/>
+                    </w:rPr>
+                    <w:t>commits</w:t>
+                  </w:r>
+                  <w:r>
+                    <w:rPr>
+                      <w:i w:val="0"/>
+                      <w:color w:val="000000"/>
+                      <w:sz w:val="18"/>
+                    </w:rPr>
+                    <w:t xml:space="preserve"> y </w:t>
+                  </w:r>
+                  <w:r>
+                    <w:rPr>
+                      <w:i/>
+                      <w:color w:val="000000"/>
+                      <w:sz w:val="18"/>
+                    </w:rPr>
+                    <w:t>pull requests</w:t>
                   </w:r>
                 </w:p>
               </w:tc>
@@ -3467,7 +3971,39 @@
                       <w:color w:val="000000"/>
                       <w:sz w:val="18"/>
                     </w:rPr>
-                    <w:t>Planificación y control; modelo de datos; proyecto base; Product Backlog; Definition of Done; diagramas E-R, de clases y de secuencia; migraciones del esquema.</w:t>
+                    <w:t xml:space="preserve">Planificación y control; modelo de datos; proyecto base; </w:t>
+                  </w:r>
+                  <w:r>
+                    <w:rPr>
+                      <w:i/>
+                      <w:color w:val="000000"/>
+                      <w:sz w:val="18"/>
+                    </w:rPr>
+                    <w:t>Product Backlog</w:t>
+                  </w:r>
+                  <w:r>
+                    <w:rPr>
+                      <w:i w:val="0"/>
+                      <w:color w:val="000000"/>
+                      <w:sz w:val="18"/>
+                    </w:rPr>
+                    <w:t xml:space="preserve">; </w:t>
+                  </w:r>
+                  <w:r>
+                    <w:rPr>
+                      <w:i/>
+                      <w:color w:val="000000"/>
+                      <w:sz w:val="18"/>
+                    </w:rPr>
+                    <w:t>Definition of Done</w:t>
+                  </w:r>
+                  <w:r>
+                    <w:rPr>
+                      <w:i w:val="0"/>
+                      <w:color w:val="000000"/>
+                      <w:sz w:val="18"/>
+                    </w:rPr>
+                    <w:t>; diagramas E-R, de clases y de secuencia; migraciones del esquema.</w:t>
                   </w:r>
                 </w:p>
               </w:tc>
@@ -3482,7 +4018,7 @@
                       <w:color w:val="000000"/>
                       <w:sz w:val="18"/>
                     </w:rPr>
-                    <w:t>16</w:t>
+                    <w:t>17</w:t>
                   </w:r>
                 </w:p>
               </w:tc>
@@ -3514,7 +4050,23 @@
                       <w:color w:val="000000"/>
                       <w:sz w:val="18"/>
                     </w:rPr>
-                    <w:t>Repositorio y README; evidencias de la Fase 1; grabación de la demostración; Product Vision; Documento de Diseño; diagramas de casos de uso, componentes y despliegue; vistas y panel de indicadores.</w:t>
+                    <w:t xml:space="preserve">Repositorio y README; evidencias de la Fase 1; grabación de la demostración; </w:t>
+                  </w:r>
+                  <w:r>
+                    <w:rPr>
+                      <w:i/>
+                      <w:color w:val="000000"/>
+                      <w:sz w:val="18"/>
+                    </w:rPr>
+                    <w:t>Product Vision</w:t>
+                  </w:r>
+                  <w:r>
+                    <w:rPr>
+                      <w:i w:val="0"/>
+                      <w:color w:val="000000"/>
+                      <w:sz w:val="18"/>
+                    </w:rPr>
+                    <w:t>; Documento de Diseño; diagramas de casos de uso, componentes y despliegue; vistas y panel de indicadores.</w:t>
                   </w:r>
                 </w:p>
               </w:tc>
@@ -3529,7 +4081,7 @@
                       <w:color w:val="000000"/>
                       <w:sz w:val="18"/>
                     </w:rPr>
-                    <w:t>13</w:t>
+                    <w:t>14</w:t>
                   </w:r>
                 </w:p>
               </w:tc>
@@ -3550,7 +4102,23 @@
                 <w:color w:val="000000"/>
                 <w:sz w:val="20"/>
               </w:rPr>
-              <w:t>La autoría se puede verificar en el historial del repositorio: cada commit conserva el nombre de quien lo escribió, incluidos los que se traspasaron mediante paquetes de Git mientras un integrante no tenía acceso a su cuenta.</w:t>
+              <w:t xml:space="preserve">La autoría se puede verificar en el historial del repositorio: cada </w:t>
+            </w:r>
+            <w:r>
+              <w:rPr>
+                <w:i/>
+                <w:color w:val="000000"/>
+                <w:sz w:val="20"/>
+              </w:rPr>
+              <w:t>commit</w:t>
+            </w:r>
+            <w:r>
+              <w:rPr>
+                <w:i w:val="0"/>
+                <w:color w:val="000000"/>
+                <w:sz w:val="20"/>
+              </w:rPr>
+              <w:t xml:space="preserve"> conserva el nombre de quien lo escribió, incluidos los que se traspasaron mediante paquetes de Git mientras un integrante no tenía acceso a su cuenta.</w:t>
             </w:r>
           </w:p>
         </w:tc>
@@ -3645,7 +4213,39 @@
                 <w:color w:val="000000"/>
                 <w:sz w:val="20"/>
               </w:rPr>
-              <w:t xml:space="preserve"> Mi interés está en el desarrollo backend y en el diseño de bases de datos, la parte del software que sostiene las reglas del negocio. Mira lo confirma: lo más exigente del proyecto no fue la interfaz, sino decidir que el estado de un equipo se deriva de su historial y garantizar que un arriendo, su cambio de estado y su movimiento se escriban juntos o no se escriban. El proyecto también me enfrentó a mis brechas declaradas en la Fase 1, las pruebas automatizadas y los contenedores, que aquí son parte de la definición de terminado y no algo opcional. Mis intereses se mantienen, con un matiz: el atraso de la Fase 2 me mostró que planificar y controlar es tan técnico como programar, y eso refuerza mi proyección hacia un rol de líder técnico, que sigue escribiendo código pero responde por la entrega del equipo.</w:t>
+              <w:t xml:space="preserve"> Mi interés está en el desarrollo </w:t>
+            </w:r>
+            <w:r>
+              <w:rPr>
+                <w:i/>
+                <w:color w:val="000000"/>
+                <w:sz w:val="20"/>
+              </w:rPr>
+              <w:t>backend</w:t>
+            </w:r>
+            <w:r>
+              <w:rPr>
+                <w:i w:val="0"/>
+                <w:color w:val="000000"/>
+                <w:sz w:val="20"/>
+              </w:rPr>
+              <w:t xml:space="preserve"> y en el diseño de bases de datos, la parte del </w:t>
+            </w:r>
+            <w:r>
+              <w:rPr>
+                <w:i/>
+                <w:color w:val="000000"/>
+                <w:sz w:val="20"/>
+              </w:rPr>
+              <w:t>software</w:t>
+            </w:r>
+            <w:r>
+              <w:rPr>
+                <w:i w:val="0"/>
+                <w:color w:val="000000"/>
+                <w:sz w:val="20"/>
+              </w:rPr>
+              <w:t xml:space="preserve"> que sostiene las reglas del negocio. Mira lo confirma: lo más exigente del proyecto no fue la interfaz, sino decidir que el estado de un equipo se deriva de su historial y garantizar que un arriendo, su cambio de estado y su movimiento se escriban juntos o no se escriban. El proyecto también me enfrentó a mis brechas declaradas en la Fase 1, las pruebas automatizadas y los contenedores, que aquí son parte de la definición de terminado y no algo opcional. Mis intereses se mantienen, con un matiz: el atraso de la Fase 2 me mostró que planificar y controlar es tan técnico como programar, y eso refuerza mi proyección hacia un rol de líder técnico, que sigue escribiendo código pero responde por la entrega del equipo.</w:t>
             </w:r>
           </w:p>
           <w:p>
@@ -3668,7 +4268,39 @@
                 <w:color w:val="000000"/>
                 <w:sz w:val="20"/>
               </w:rPr>
-              <w:t xml:space="preserve"> Mis intereses están en el desarrollo web, en particular en la construcción de interfaces, y en el análisis de datos. En Mira asumí los controladores, las vistas, el panel de indicadores y el módulo documental, además de la documentación y las presentaciones. El panel es mi puerta de entrada al análisis de datos: convertir el historial de cada equipo en indicadores de utilización y de retornos vencidos exige entender cómo se registran los datos antes de presentarlos, y me obliga a fortalecer el modelado y las consultas complejas, que identifiqué como mi principal brecha. Provengo de la prevención de riesgos, y este proyecto consolida mi transición hacia el desarrollo de software; me proyecto como desarrollador frontend en un equipo donde pueda seguir profundizando en datos.</w:t>
+              <w:t xml:space="preserve"> Mis intereses están en el desarrollo web, en particular en la construcción de interfaces, y en el análisis de datos. En Mira asumí los controladores, las vistas, el panel de indicadores y el módulo documental, además de la documentación y las presentaciones. El panel es mi puerta de entrada al análisis de datos: convertir el historial de cada equipo en indicadores de utilización y de retornos vencidos exige entender cómo se registran los datos antes de presentarlos, y me obliga a fortalecer el modelado y las consultas complejas, que identifiqué como mi principal brecha. Provengo de la prevención de riesgos, y este proyecto consolida mi transición hacia el desarrollo de </w:t>
+            </w:r>
+            <w:r>
+              <w:rPr>
+                <w:i/>
+                <w:color w:val="000000"/>
+                <w:sz w:val="20"/>
+              </w:rPr>
+              <w:t>software</w:t>
+            </w:r>
+            <w:r>
+              <w:rPr>
+                <w:i w:val="0"/>
+                <w:color w:val="000000"/>
+                <w:sz w:val="20"/>
+              </w:rPr>
+              <w:t xml:space="preserve">; me proyecto como desarrollador </w:t>
+            </w:r>
+            <w:r>
+              <w:rPr>
+                <w:i/>
+                <w:color w:val="000000"/>
+                <w:sz w:val="20"/>
+              </w:rPr>
+              <w:t>frontend</w:t>
+            </w:r>
+            <w:r>
+              <w:rPr>
+                <w:i w:val="0"/>
+                <w:color w:val="000000"/>
+                <w:sz w:val="20"/>
+              </w:rPr>
+              <w:t xml:space="preserve"> en un equipo donde pueda seguir profundizando en datos.</w:t>
             </w:r>
           </w:p>
         </w:tc>

</xml_diff>

<commit_message>
docs: actualizar el informe 2.6 con las migraciones aplicadas
Incluye las migraciones V1 y V2 entre las evidencias, corrige a catorce el
número de tablas y registra como ajuste la corrección de Flyway detectada
al probar las migraciones.

Co-Authored-By: Claude Opus 5.5 <noreply@anthropic.com>
Claude-Session: https://claude.ai/code/session_019yAiQ6SJ8faHeryAa6w9Vi
</commit_message>
<xml_diff>
--- a/Fase 2/Evidencias Grupales/2.6_GuiaEstudiante_Fase 2_Informe Final Proyecto APT.docx
+++ b/Fase 2/Evidencias Grupales/2.6_GuiaEstudiante_Fase 2_Informe Final Proyecto APT.docx
@@ -1560,7 +1560,7 @@
                 <w:color w:val="000000"/>
                 <w:sz w:val="20"/>
               </w:rPr>
-              <w:t xml:space="preserve"> Modelo entidad-relación de trece tablas con su diccionario, arquitectura en capas, convenciones de código y catálogo de casos de prueba, todo antes de escribir código.</w:t>
+              <w:t xml:space="preserve"> Modelo entidad-relación de catorce tablas con su diccionario, arquitectura en capas, convenciones de código y catálogo de casos de prueba, todo antes de escribir código.</w:t>
             </w:r>
           </w:p>
           <w:p>
@@ -2101,7 +2101,7 @@
                       <w:color w:val="000000"/>
                       <w:sz w:val="18"/>
                     </w:rPr>
-                    <w:t>Completada: 13 tablas con diccionario</w:t>
+                    <w:t>Completada: 14 tablas con diccionario</w:t>
                   </w:r>
                 </w:p>
               </w:tc>
@@ -2258,7 +2258,7 @@
                       <w:color w:val="000000"/>
                       <w:sz w:val="18"/>
                     </w:rPr>
-                    <w:t>Con retraso: en curso en la semana 8</w:t>
+                    <w:t>En curso: migraciones V1 y V2 aplicadas y probadas en la semana 8; faltan las entidades JPA</w:t>
                   </w:r>
                 </w:p>
               </w:tc>
@@ -2879,6 +2879,25 @@
                 <w:sz w:val="20"/>
               </w:rPr>
               <w:t>, a sugerencia del docente.</w:t>
+            </w:r>
+          </w:p>
+          <w:p>
+            <w:pPr>
+              <w:numPr>
+                <w:ilvl w:val="0"/>
+                <w:numId w:val="1"/>
+              </w:numPr>
+              <w:spacing w:after="40"/>
+              <w:ind w:left="360" w:hanging="240"/>
+              <w:jc w:val="both"/>
+            </w:pPr>
+            <w:r>
+              <w:rPr>
+                <w:i w:val="0"/>
+                <w:color w:val="000000"/>
+                <w:sz w:val="20"/>
+              </w:rPr>
+              <w:t>Al aplicar por primera vez las migraciones se detectó que Flyway no se ejecutaba: en Spring Boot 4 su configuración automática requiere un módulo propio. Se corrigió (decisión D12) y se agregó una prueba automatizada que verifica que ambas migraciones queden aplicadas.</w:t>
             </w:r>
           </w:p>
           <w:p>
@@ -3549,7 +3568,54 @@
                       <w:color w:val="000000"/>
                       <w:sz w:val="18"/>
                     </w:rPr>
-                    <w:t>Diseño del modelo de datos (13 tablas)</w:t>
+                    <w:t>Diseño del modelo de datos (14 tablas)</w:t>
+                  </w:r>
+                </w:p>
+              </w:tc>
+            </w:tr>
+            <w:tr>
+              <w:tc>
+                <w:tcPr>
+                  <w:tcW w:type="dxa" w:w="2306"/>
+                </w:tcPr>
+                <w:p>
+                  <w:r>
+                    <w:rPr>
+                      <w:i w:val="0"/>
+                      <w:color w:val="000000"/>
+                      <w:sz w:val="18"/>
+                    </w:rPr>
+                    <w:t>Migraciones V1 y V2 y su prueba automatizada</w:t>
+                  </w:r>
+                </w:p>
+              </w:tc>
+              <w:tc>
+                <w:tcPr>
+                  <w:tcW w:type="dxa" w:w="2063"/>
+                </w:tcPr>
+                <w:p>
+                  <w:r>
+                    <w:rPr>
+                      <w:i w:val="0"/>
+                      <w:color w:val="000000"/>
+                      <w:sz w:val="18"/>
+                    </w:rPr>
+                    <w:t>src/main/resources/db/migration y src/test</w:t>
+                  </w:r>
+                </w:p>
+              </w:tc>
+              <w:tc>
+                <w:tcPr>
+                  <w:tcW w:type="dxa" w:w="2124"/>
+                </w:tcPr>
+                <w:p>
+                  <w:r>
+                    <w:rPr>
+                      <w:i w:val="0"/>
+                      <w:color w:val="000000"/>
+                      <w:sz w:val="18"/>
+                    </w:rPr>
+                    <w:t>Implementación del modelo en PostgreSQL 16, verificada con Testcontainers</w:t>
                   </w:r>
                 </w:p>
               </w:tc>
@@ -4018,7 +4084,7 @@
                       <w:color w:val="000000"/>
                       <w:sz w:val="18"/>
                     </w:rPr>
-                    <w:t>17</w:t>
+                    <w:t>20</w:t>
                   </w:r>
                 </w:p>
               </w:tc>
@@ -4081,7 +4147,7 @@
                       <w:color w:val="000000"/>
                       <w:sz w:val="18"/>
                     </w:rPr>
-                    <w:t>14</w:t>
+                    <w:t>16</w:t>
                   </w:r>
                 </w:p>
               </w:tc>

</xml_diff>

<commit_message>
docs: incluir en el informe 2.6 el código, las pruebas y las capturas del Sprint 2
Co-Authored-By: Claude Opus 5.5 <noreply@anthropic.com>
Claude-Session: https://claude.ai/code/session_019yAiQ6SJ8faHeryAa6w9Vi
</commit_message>
<xml_diff>
--- a/Fase 2/Evidencias Grupales/2.6_GuiaEstudiante_Fase 2_Informe Final Proyecto APT.docx
+++ b/Fase 2/Evidencias Grupales/2.6_GuiaEstudiante_Fase 2_Informe Final Proyecto APT.docx
@@ -2258,7 +2258,7 @@
                       <w:color w:val="000000"/>
                       <w:sz w:val="18"/>
                     </w:rPr>
-                    <w:t>En curso: migraciones V1 y V2 aplicadas y probadas en la semana 8; faltan las entidades JPA</w:t>
+                    <w:t>Completada en la semana 8: migraciones V1 y V2 y entidades de usuarios e inventario</w:t>
                   </w:r>
                 </w:p>
               </w:tc>
@@ -2305,7 +2305,7 @@
                       <w:color w:val="000000"/>
                       <w:sz w:val="18"/>
                     </w:rPr>
-                    <w:t>Con retraso: Sprint 2 en curso</w:t>
+                    <w:t>En curso: HU-01 a HU-08 implementadas y probadas en la semana 8; faltan traslados y disponibilidad</w:t>
                   </w:r>
                 </w:p>
               </w:tc>
@@ -3820,6 +3820,147 @@
                       <w:color w:val="000000"/>
                       <w:sz w:val="18"/>
                     </w:rPr>
+                    <w:t>Código del Sprint 2: acceso por rol, usuarios, bodegas y equipos</w:t>
+                  </w:r>
+                </w:p>
+              </w:tc>
+              <w:tc>
+                <w:tcPr>
+                  <w:tcW w:type="dxa" w:w="2063"/>
+                </w:tcPr>
+                <w:p>
+                  <w:r>
+                    <w:rPr>
+                      <w:i w:val="0"/>
+                      <w:color w:val="000000"/>
+                      <w:sz w:val="18"/>
+                    </w:rPr>
+                    <w:t>src/main/java/cl/duoc/mira</w:t>
+                  </w:r>
+                </w:p>
+              </w:tc>
+              <w:tc>
+                <w:tcPr>
+                  <w:tcW w:type="dxa" w:w="2124"/>
+                </w:tcPr>
+                <w:p>
+                  <w:r>
+                    <w:rPr>
+                      <w:i w:val="0"/>
+                      <w:color w:val="000000"/>
+                      <w:sz w:val="18"/>
+                    </w:rPr>
+                    <w:t>Historias HU-01 a HU-08 implementadas en capas, con filtro por empresa</w:t>
+                  </w:r>
+                </w:p>
+              </w:tc>
+            </w:tr>
+            <w:tr>
+              <w:tc>
+                <w:tcPr>
+                  <w:tcW w:type="dxa" w:w="2306"/>
+                </w:tcPr>
+                <w:p>
+                  <w:r>
+                    <w:rPr>
+                      <w:i w:val="0"/>
+                      <w:color w:val="000000"/>
+                      <w:sz w:val="18"/>
+                    </w:rPr>
+                    <w:t>Pruebas automatizadas (29)</w:t>
+                  </w:r>
+                </w:p>
+              </w:tc>
+              <w:tc>
+                <w:tcPr>
+                  <w:tcW w:type="dxa" w:w="2063"/>
+                </w:tcPr>
+                <w:p>
+                  <w:r>
+                    <w:rPr>
+                      <w:i w:val="0"/>
+                      <w:color w:val="000000"/>
+                      <w:sz w:val="18"/>
+                    </w:rPr>
+                    <w:t>src/test/java</w:t>
+                  </w:r>
+                </w:p>
+              </w:tc>
+              <w:tc>
+                <w:tcPr>
+                  <w:tcW w:type="dxa" w:w="2124"/>
+                </w:tcPr>
+                <w:p>
+                  <w:r>
+                    <w:rPr>
+                      <w:i w:val="0"/>
+                      <w:color w:val="000000"/>
+                      <w:sz w:val="18"/>
+                    </w:rPr>
+                    <w:t>Reglas de negocio, permisos por rol (CF-11), acceso sin sesión (PNF-05) y migraciones</w:t>
+                  </w:r>
+                </w:p>
+              </w:tc>
+            </w:tr>
+            <w:tr>
+              <w:tc>
+                <w:tcPr>
+                  <w:tcW w:type="dxa" w:w="2306"/>
+                </w:tcPr>
+                <w:p>
+                  <w:r>
+                    <w:rPr>
+                      <w:i w:val="0"/>
+                      <w:color w:val="000000"/>
+                      <w:sz w:val="18"/>
+                    </w:rPr>
+                    <w:t>Capturas del recorrido del sistema</w:t>
+                  </w:r>
+                </w:p>
+              </w:tc>
+              <w:tc>
+                <w:tcPr>
+                  <w:tcW w:type="dxa" w:w="2063"/>
+                </w:tcPr>
+                <w:p>
+                  <w:r>
+                    <w:rPr>
+                      <w:i w:val="0"/>
+                      <w:color w:val="000000"/>
+                      <w:sz w:val="18"/>
+                    </w:rPr>
+                    <w:t>docs/evidencias/semana-08</w:t>
+                  </w:r>
+                </w:p>
+              </w:tc>
+              <w:tc>
+                <w:tcPr>
+                  <w:tcW w:type="dxa" w:w="2124"/>
+                </w:tcPr>
+                <w:p>
+                  <w:r>
+                    <w:rPr>
+                      <w:i w:val="0"/>
+                      <w:color w:val="000000"/>
+                      <w:sz w:val="18"/>
+                    </w:rPr>
+                    <w:t>Funcionamiento de cada historia del Sprint 2</w:t>
+                  </w:r>
+                </w:p>
+              </w:tc>
+            </w:tr>
+            <w:tr>
+              <w:tc>
+                <w:tcPr>
+                  <w:tcW w:type="dxa" w:w="2306"/>
+                </w:tcPr>
+                <w:p>
+                  <w:r>
+                    <w:rPr>
+                      <w:i w:val="0"/>
+                      <w:color w:val="000000"/>
+                      <w:sz w:val="18"/>
+                    </w:rPr>
                     <w:t>Demostración del sistema levantando</w:t>
                   </w:r>
                 </w:p>
@@ -4069,7 +4210,7 @@
                       <w:color w:val="000000"/>
                       <w:sz w:val="18"/>
                     </w:rPr>
-                    <w:t>; diagramas E-R, de clases y de secuencia; migraciones del esquema.</w:t>
+                    <w:t>; diagramas E-R, de clases y de secuencia; migraciones del esquema; entidades, servicios y pruebas de negocio del Sprint 2.</w:t>
                   </w:r>
                 </w:p>
               </w:tc>
@@ -4084,7 +4225,7 @@
                       <w:color w:val="000000"/>
                       <w:sz w:val="18"/>
                     </w:rPr>
-                    <w:t>20</w:t>
+                    <w:t>26</w:t>
                   </w:r>
                 </w:p>
               </w:tc>
@@ -4132,7 +4273,7 @@
                       <w:color w:val="000000"/>
                       <w:sz w:val="18"/>
                     </w:rPr>
-                    <w:t>; Documento de Diseño; diagramas de casos de uso, componentes y despliegue; vistas y panel de indicadores.</w:t>
+                    <w:t>; Documento de Diseño; diagramas de casos de uso, componentes y despliegue; controladores, vistas y pruebas de permisos del Sprint 2.</w:t>
                   </w:r>
                 </w:p>
               </w:tc>
@@ -4147,7 +4288,7 @@
                       <w:color w:val="000000"/>
                       <w:sz w:val="18"/>
                     </w:rPr>
-                    <w:t>16</w:t>
+                    <w:t>18</w:t>
                   </w:r>
                 </w:p>
               </w:tc>

</xml_diff>

<commit_message>
docs: actualizar el conteo de commits del informe 2.6
Co-Authored-By: Claude Opus 5.5 <noreply@anthropic.com>
Claude-Session: https://claude.ai/code/session_019yAiQ6SJ8faHeryAa6w9Vi
</commit_message>
<xml_diff>
--- a/Fase 2/Evidencias Grupales/2.6_GuiaEstudiante_Fase 2_Informe Final Proyecto APT.docx
+++ b/Fase 2/Evidencias Grupales/2.6_GuiaEstudiante_Fase 2_Informe Final Proyecto APT.docx
@@ -4225,7 +4225,7 @@
                       <w:color w:val="000000"/>
                       <w:sz w:val="18"/>
                     </w:rPr>
-                    <w:t>26</w:t>
+                    <w:t>28</w:t>
                   </w:r>
                 </w:p>
               </w:tc>
@@ -4288,7 +4288,7 @@
                       <w:color w:val="000000"/>
                       <w:sz w:val="18"/>
                     </w:rPr>
-                    <w:t>18</w:t>
+                    <w:t>19</w:t>
                   </w:r>
                 </w:p>
               </w:tc>

</xml_diff>

<commit_message>
docs: actualizar el conteo final de commits en el informe y la presentación
Co-Authored-By: Claude Opus 5.5 <noreply@anthropic.com>
Claude-Session: https://claude.ai/code/session_019yAiQ6SJ8faHeryAa6w9Vi
</commit_message>
<xml_diff>
--- a/Fase 2/Evidencias Grupales/2.6_GuiaEstudiante_Fase 2_Informe Final Proyecto APT.docx
+++ b/Fase 2/Evidencias Grupales/2.6_GuiaEstudiante_Fase 2_Informe Final Proyecto APT.docx
@@ -4225,7 +4225,7 @@
                       <w:color w:val="000000"/>
                       <w:sz w:val="18"/>
                     </w:rPr>
-                    <w:t>28</w:t>
+                    <w:t>30</w:t>
                   </w:r>
                 </w:p>
               </w:tc>
@@ -4288,7 +4288,7 @@
                       <w:color w:val="000000"/>
                       <w:sz w:val="18"/>
                     </w:rPr>
-                    <w:t>19</w:t>
+                    <w:t>21</w:t>
                   </w:r>
                 </w:p>
               </w:tc>

</xml_diff>

<commit_message>
docs: describir en el informe y la presentación el aplazamiento de las reuniones
Co-Authored-By: Claude Opus 5.5 <noreply@anthropic.com>
Claude-Session: https://claude.ai/code/session_019yAiQ6SJ8faHeryAa6w9Vi
</commit_message>
<xml_diff>
--- a/Fase 2/Evidencias Grupales/2.6_GuiaEstudiante_Fase 2_Informe Final Proyecto APT.docx
+++ b/Fase 2/Evidencias Grupales/2.6_GuiaEstudiante_Fase 2_Informe Final Proyecto APT.docx
@@ -1170,7 +1170,7 @@
                 <w:color w:val="000000"/>
                 <w:sz w:val="20"/>
               </w:rPr>
-              <w:t xml:space="preserve"> La contraparte no continuó la colaboración después de la reunión inicial y, con autorización del docente, el proyecto sigue sin cliente real; el aporte es, por tanto, simulado sobre una caracterización real. Se expresa en metas medibles del </w:t>
+              <w:t xml:space="preserve"> El aporte se expresa en las metas medibles del </w:t>
             </w:r>
             <w:r>
               <w:rPr>
@@ -1186,7 +1186,7 @@
                 <w:color w:val="000000"/>
                 <w:sz w:val="20"/>
               </w:rPr>
-              <w:t>: responder una consulta de disponibilidad en menos de 2 segundos, identificar el 100 % de los equipos por número de serie, alertar el 100 % de los arriendos vencidos y llevar a cero los equipos comprometidos en dos operaciones a la vez.</w:t>
+              <w:t>, que verifican los casos de prueba del proyecto: responder una consulta de disponibilidad en menos de 2 segundos, identificar el 100 % de los equipos por número de serie, alertar el 100 % de los arriendos vencidos y llevar a cero los equipos comprometidos en dos operaciones a la vez.</w:t>
             </w:r>
           </w:p>
         </w:tc>
@@ -1411,7 +1411,7 @@
                 <w:color w:val="000000"/>
                 <w:sz w:val="20"/>
               </w:rPr>
-              <w:t>Los objetivos se mantienen sin cambios de redacción respecto de la Fase 1. Lo que cambió es la forma de cumplir dos de ellos: el levantamiento se cerró con la información de la reunión inicial y los vacíos quedaron como supuestos de diseño declarados, y la validación con la contraparte se reemplaza por la validación con el docente y por la verificación automatizada de cada criterio de aceptación.</w:t>
+              <w:t>Los objetivos se mantienen sin cambios de redacción respecto de la Fase 1. Los vacíos de información del levantamiento quedaron como supuestos de diseño declarados, y la validación de la solución se apoya en la verificación automatizada de cada criterio de aceptación.</w:t>
             </w:r>
           </w:p>
         </w:tc>
@@ -1793,7 +1793,7 @@
                 <w:color w:val="000000"/>
                 <w:sz w:val="20"/>
               </w:rPr>
-              <w:t xml:space="preserve"> Joaquín Romero lidera la planificación y el control del avance y es responsable del modelo de datos y de la capa de servicios. Gonzalo Arenas es responsable de los controladores, las vistas, el panel de indicadores y el módulo documental, y lidera la documentación y las presentaciones. Al no haber contraparte, el equipo asume el rol de dueño del producto y el docente valida el alcance.</w:t>
+              <w:t xml:space="preserve"> Joaquín Romero lidera la planificación y el control del avance y es responsable del modelo de datos y de la capa de servicios. Gonzalo Arenas es responsable de los controladores, las vistas, el panel de indicadores y el módulo documental, y lidera la documentación y las presentaciones. El docente valida el alcance en las instancias de control de avance.</w:t>
             </w:r>
           </w:p>
           <w:p>
@@ -2007,7 +2007,7 @@
                       <w:color w:val="000000"/>
                       <w:sz w:val="18"/>
                     </w:rPr>
-                    <w:t>Ajustada: cerrada con la reunión inicial y supuestos declarados</w:t>
+                    <w:t>Ajustada: vacíos resueltos como supuestos de diseño declarados</w:t>
                   </w:r>
                 </w:p>
               </w:tc>
@@ -2580,15 +2580,15 @@
                 <w:color w:val="000000"/>
                 <w:sz w:val="20"/>
               </w:rPr>
-              <w:t>Pérdida de la contraparte.</w:t>
-            </w:r>
-            <w:r>
-              <w:rPr>
-                <w:i w:val="0"/>
-                <w:color w:val="000000"/>
-                <w:sz w:val="20"/>
-              </w:rPr>
-              <w:t xml:space="preserve"> La reunión de levantamiento no prosperó y las validaciones de las semanas 6 y 11 no se concretaron.</w:t>
+              <w:t>Aplazamiento de las reuniones con la empresa.</w:t>
+            </w:r>
+            <w:r>
+              <w:rPr>
+                <w:i w:val="0"/>
+                <w:color w:val="000000"/>
+                <w:sz w:val="20"/>
+              </w:rPr>
+              <w:t xml:space="preserve"> Las instancias de validación de las semanas 6 y 11 se aplazaron y el proyecto no podía seguir esperando.</w:t>
             </w:r>
           </w:p>
           <w:p>
@@ -2722,7 +2722,7 @@
                 <w:color w:val="000000"/>
                 <w:sz w:val="20"/>
               </w:rPr>
-              <w:t>Se consultó al docente y se autorizó continuar sin cliente real; los supuestos del modelo pasaron a ser decisiones de diseño declaradas.</w:t>
+              <w:t>Se consultó al docente y se continuó con la propuesta original; los supuestos del modelo pasaron a ser decisiones de diseño declaradas.</w:t>
             </w:r>
           </w:p>
           <w:p>
@@ -3105,7 +3105,7 @@
                       <w:color w:val="000000"/>
                       <w:sz w:val="18"/>
                     </w:rPr>
-                    <w:t>Consultar al docente en vez de seguir esperando a la contraparte.</w:t>
+                    <w:t>Consultar al docente en vez de esperar las reuniones aplazadas.</w:t>
                   </w:r>
                 </w:p>
               </w:tc>
@@ -4225,7 +4225,7 @@
                       <w:color w:val="000000"/>
                       <w:sz w:val="18"/>
                     </w:rPr>
-                    <w:t>30</w:t>
+                    <w:t>32</w:t>
                   </w:r>
                 </w:p>
               </w:tc>
@@ -4288,7 +4288,7 @@
                       <w:color w:val="000000"/>
                       <w:sz w:val="18"/>
                     </w:rPr>
-                    <w:t>21</w:t>
+                    <w:t>23</w:t>
                   </w:r>
                 </w:p>
               </w:tc>

</xml_diff>